<commit_message>
(Testing Documentation) verified board amplifies INPUT 1Hz (+-15mV) differential signal with 2.5V offset to ~=(0-3V) -(TODO)Noted attenuation of input signal as frequency increases
</commit_message>
<xml_diff>
--- a/Revision01/Testing/AmplifierTestingProcedure.docx
+++ b/Revision01/Testing/AmplifierTestingProcedure.docx
@@ -323,6 +323,9 @@
       </w:pPr>
       <w:r>
         <w:t>Test algorithm</w:t>
+      </w:r>
+      <w:r>
+        <w:t>(DC, SIN, STEP, FREQ)</w:t>
       </w:r>
     </w:p>
     <w:p>
@@ -364,6 +367,12 @@
           </m:sub>
         </m:sSub>
       </m:oMath>
+      <w:r>
+        <w:rPr>
+          <w:rFonts w:eastAsiaTheme="minorEastAsia"/>
+        </w:rPr>
+        <w:t xml:space="preserve"> = 0V</w:t>
+      </w:r>
     </w:p>
     <w:p>
       <w:pPr>
@@ -404,6 +413,12 @@
           </m:sub>
         </m:sSub>
       </m:oMath>
+      <w:r>
+        <w:rPr>
+          <w:rFonts w:eastAsiaTheme="minorEastAsia"/>
+        </w:rPr>
+        <w:t xml:space="preserve"> scope </w:t>
+      </w:r>
     </w:p>
     <w:p>
       <w:pPr>
@@ -421,6 +436,55 @@
       </w:r>
       <w:r>
         <w:t xml:space="preserve"> at 10Hz</w:t>
+      </w:r>
+      <w:r>
+        <w:t xml:space="preserve"> – (-10mV,10mV) </w:t>
+      </w:r>
+    </w:p>
+    <w:p>
+      <w:pPr>
+        <w:pStyle w:val="ListParagraph"/>
+        <w:numPr>
+          <w:ilvl w:val="0"/>
+          <w:numId w:val="5"/>
+        </w:numPr>
+      </w:pPr>
+      <w:r>
+        <w:t xml:space="preserve">Measure </w:t>
+      </w:r>
+      <m:oMath>
+        <m:sSub>
+          <m:sSubPr>
+            <m:ctrlPr>
+              <w:rPr>
+                <w:rFonts w:ascii="Cambria Math" w:hAnsi="Cambria Math"/>
+                <w:i/>
+              </w:rPr>
+            </m:ctrlPr>
+          </m:sSubPr>
+          <m:e>
+            <m:r>
+              <w:rPr>
+                <w:rFonts w:ascii="Cambria Math" w:hAnsi="Cambria Math"/>
+              </w:rPr>
+              <m:t>V</m:t>
+            </m:r>
+          </m:e>
+          <m:sub>
+            <m:r>
+              <w:rPr>
+                <w:rFonts w:ascii="Cambria Math" w:hAnsi="Cambria Math"/>
+              </w:rPr>
+              <m:t>in</m:t>
+            </m:r>
+          </m:sub>
+        </m:sSub>
+      </m:oMath>
+      <w:r>
+        <w:rPr>
+          <w:rFonts w:eastAsiaTheme="minorEastAsia"/>
+        </w:rPr>
+        <w:t xml:space="preserve"> scope </w:t>
       </w:r>
     </w:p>
     <w:p>

</xml_diff>